<commit_message>
added some sequence diagram and finalize use case specification diagram
</commit_message>
<xml_diff>
--- a/SDS Document Diagram.docx
+++ b/SDS Document Diagram.docx
@@ -11,7 +11,6 @@
       </w:r>
     </w:p>
     <w:p>
-      <w:bookmarkStart w:id="0" w:name="_GoBack"/>
       <w:r>
         <w:rPr>
           <w:noProof/>
@@ -65,8 +64,631 @@
           </wp:inline>
         </w:drawing>
       </w:r>
+    </w:p>
+    <w:p>
+      <w:pPr>
+        <w:pStyle w:val="Heading1"/>
+      </w:pPr>
+      <w:r>
+        <w:lastRenderedPageBreak/>
+        <w:t>Sequence Diagrams</w:t>
+      </w:r>
+    </w:p>
+    <w:p>
+      <w:pPr>
+        <w:pStyle w:val="Heading2"/>
+        <w:rPr>
+          <w:rFonts w:eastAsia="Times New Roman"/>
+        </w:rPr>
+      </w:pPr>
+      <w:r>
+        <w:rPr>
+          <w:rFonts w:eastAsia="Times New Roman"/>
+        </w:rPr>
+        <w:t>Rider Registration &amp; Approval (UC-11) – Sequence Diagram (v4.0 – Final)</w:t>
+      </w:r>
+    </w:p>
+    <w:p>
+      <w:r>
+        <w:rPr>
+          <w:noProof/>
+        </w:rPr>
+        <w:lastRenderedPageBreak/>
+        <w:drawing>
+          <wp:inline distT="0" distB="0" distL="0" distR="0" wp14:anchorId="0A520F8D" wp14:editId="13AA4025">
+            <wp:extent cx="5943600" cy="7851380"/>
+            <wp:effectExtent l="0" t="0" r="0" b="0"/>
+            <wp:docPr id="3" name="Picture 3"/>
+            <wp:cNvGraphicFramePr>
+              <a:graphicFrameLocks xmlns:a="http://schemas.openxmlformats.org/drawingml/2006/main" noChangeAspect="1"/>
+            </wp:cNvGraphicFramePr>
+            <a:graphic xmlns:a="http://schemas.openxmlformats.org/drawingml/2006/main">
+              <a:graphicData uri="http://schemas.openxmlformats.org/drawingml/2006/picture">
+                <pic:pic xmlns:pic="http://schemas.openxmlformats.org/drawingml/2006/picture">
+                  <pic:nvPicPr>
+                    <pic:cNvPr id="0" name="Picture 3"/>
+                    <pic:cNvPicPr>
+                      <a:picLocks noChangeAspect="1" noChangeArrowheads="1"/>
+                    </pic:cNvPicPr>
+                  </pic:nvPicPr>
+                  <pic:blipFill>
+                    <a:blip r:embed="rId5" cstate="print">
+                      <a:extLst>
+                        <a:ext uri="{28A0092B-C50C-407E-A947-70E740481C1C}">
+                          <a14:useLocalDpi xmlns:a14="http://schemas.microsoft.com/office/drawing/2010/main" val="0"/>
+                        </a:ext>
+                      </a:extLst>
+                    </a:blip>
+                    <a:srcRect/>
+                    <a:stretch>
+                      <a:fillRect/>
+                    </a:stretch>
+                  </pic:blipFill>
+                  <pic:spPr bwMode="auto">
+                    <a:xfrm>
+                      <a:off x="0" y="0"/>
+                      <a:ext cx="5943600" cy="7851380"/>
+                    </a:xfrm>
+                    <a:prstGeom prst="rect">
+                      <a:avLst/>
+                    </a:prstGeom>
+                    <a:noFill/>
+                    <a:ln>
+                      <a:noFill/>
+                    </a:ln>
+                  </pic:spPr>
+                </pic:pic>
+              </a:graphicData>
+            </a:graphic>
+          </wp:inline>
+        </w:drawing>
+      </w:r>
+    </w:p>
+    <w:p>
+      <w:pPr>
+        <w:pStyle w:val="Heading2"/>
+      </w:pPr>
+      <w:r>
+        <w:lastRenderedPageBreak/>
+        <w:t>View &amp; Accept Orders (UC-12) – Sequence Diagram</w:t>
+      </w:r>
+    </w:p>
+    <w:p/>
+    <w:p>
+      <w:r>
+        <w:rPr>
+          <w:noProof/>
+        </w:rPr>
+        <w:drawing>
+          <wp:inline distT="0" distB="0" distL="0" distR="0" wp14:anchorId="312E695E" wp14:editId="5E4CD6D7">
+            <wp:extent cx="5943600" cy="6448732"/>
+            <wp:effectExtent l="0" t="0" r="0" b="9525"/>
+            <wp:docPr id="4" name="Picture 4"/>
+            <wp:cNvGraphicFramePr>
+              <a:graphicFrameLocks xmlns:a="http://schemas.openxmlformats.org/drawingml/2006/main" noChangeAspect="1"/>
+            </wp:cNvGraphicFramePr>
+            <a:graphic xmlns:a="http://schemas.openxmlformats.org/drawingml/2006/main">
+              <a:graphicData uri="http://schemas.openxmlformats.org/drawingml/2006/picture">
+                <pic:pic xmlns:pic="http://schemas.openxmlformats.org/drawingml/2006/picture">
+                  <pic:nvPicPr>
+                    <pic:cNvPr id="0" name="Picture 5"/>
+                    <pic:cNvPicPr>
+                      <a:picLocks noChangeAspect="1" noChangeArrowheads="1"/>
+                    </pic:cNvPicPr>
+                  </pic:nvPicPr>
+                  <pic:blipFill>
+                    <a:blip r:embed="rId6" cstate="print">
+                      <a:extLst>
+                        <a:ext uri="{28A0092B-C50C-407E-A947-70E740481C1C}">
+                          <a14:useLocalDpi xmlns:a14="http://schemas.microsoft.com/office/drawing/2010/main" val="0"/>
+                        </a:ext>
+                      </a:extLst>
+                    </a:blip>
+                    <a:srcRect/>
+                    <a:stretch>
+                      <a:fillRect/>
+                    </a:stretch>
+                  </pic:blipFill>
+                  <pic:spPr bwMode="auto">
+                    <a:xfrm>
+                      <a:off x="0" y="0"/>
+                      <a:ext cx="5943600" cy="6448732"/>
+                    </a:xfrm>
+                    <a:prstGeom prst="rect">
+                      <a:avLst/>
+                    </a:prstGeom>
+                    <a:noFill/>
+                    <a:ln>
+                      <a:noFill/>
+                    </a:ln>
+                  </pic:spPr>
+                </pic:pic>
+              </a:graphicData>
+            </a:graphic>
+          </wp:inline>
+        </w:drawing>
+      </w:r>
+    </w:p>
+    <w:p>
+      <w:pPr>
+        <w:pStyle w:val="Heading2"/>
+      </w:pPr>
+      <w:r>
+        <w:lastRenderedPageBreak/>
+        <w:t>Follow Optimized Route (Pickup &amp; Delivery)</w:t>
+      </w:r>
+    </w:p>
+    <w:p>
+      <w:r>
+        <w:rPr>
+          <w:noProof/>
+        </w:rPr>
+        <w:lastRenderedPageBreak/>
+        <w:drawing>
+          <wp:inline distT="0" distB="0" distL="0" distR="0" wp14:anchorId="1996D3B2" wp14:editId="4075E76A">
+            <wp:extent cx="5943600" cy="8239503"/>
+            <wp:effectExtent l="0" t="0" r="0" b="9525"/>
+            <wp:docPr id="5" name="Picture 5"/>
+            <wp:cNvGraphicFramePr>
+              <a:graphicFrameLocks xmlns:a="http://schemas.openxmlformats.org/drawingml/2006/main" noChangeAspect="1"/>
+            </wp:cNvGraphicFramePr>
+            <a:graphic xmlns:a="http://schemas.openxmlformats.org/drawingml/2006/main">
+              <a:graphicData uri="http://schemas.openxmlformats.org/drawingml/2006/picture">
+                <pic:pic xmlns:pic="http://schemas.openxmlformats.org/drawingml/2006/picture">
+                  <pic:nvPicPr>
+                    <pic:cNvPr id="0" name="Picture 7"/>
+                    <pic:cNvPicPr>
+                      <a:picLocks noChangeAspect="1" noChangeArrowheads="1"/>
+                    </pic:cNvPicPr>
+                  </pic:nvPicPr>
+                  <pic:blipFill>
+                    <a:blip r:embed="rId7" cstate="print">
+                      <a:extLst>
+                        <a:ext uri="{28A0092B-C50C-407E-A947-70E740481C1C}">
+                          <a14:useLocalDpi xmlns:a14="http://schemas.microsoft.com/office/drawing/2010/main" val="0"/>
+                        </a:ext>
+                      </a:extLst>
+                    </a:blip>
+                    <a:srcRect/>
+                    <a:stretch>
+                      <a:fillRect/>
+                    </a:stretch>
+                  </pic:blipFill>
+                  <pic:spPr bwMode="auto">
+                    <a:xfrm>
+                      <a:off x="0" y="0"/>
+                      <a:ext cx="5943600" cy="8239503"/>
+                    </a:xfrm>
+                    <a:prstGeom prst="rect">
+                      <a:avLst/>
+                    </a:prstGeom>
+                    <a:noFill/>
+                    <a:ln>
+                      <a:noFill/>
+                    </a:ln>
+                  </pic:spPr>
+                </pic:pic>
+              </a:graphicData>
+            </a:graphic>
+          </wp:inline>
+        </w:drawing>
+      </w:r>
+    </w:p>
+    <w:p>
+      <w:pPr>
+        <w:pStyle w:val="Heading2"/>
+      </w:pPr>
+      <w:r>
+        <w:lastRenderedPageBreak/>
+        <w:t>Confirm Product Availability</w:t>
+      </w:r>
+    </w:p>
+    <w:p>
+      <w:r>
+        <w:rPr>
+          <w:noProof/>
+        </w:rPr>
+        <w:drawing>
+          <wp:inline distT="0" distB="0" distL="0" distR="0" wp14:anchorId="24EA289E" wp14:editId="68E25243">
+            <wp:extent cx="5943600" cy="4552545"/>
+            <wp:effectExtent l="0" t="0" r="0" b="635"/>
+            <wp:docPr id="6" name="Picture 6"/>
+            <wp:cNvGraphicFramePr>
+              <a:graphicFrameLocks xmlns:a="http://schemas.openxmlformats.org/drawingml/2006/main" noChangeAspect="1"/>
+            </wp:cNvGraphicFramePr>
+            <a:graphic xmlns:a="http://schemas.openxmlformats.org/drawingml/2006/main">
+              <a:graphicData uri="http://schemas.openxmlformats.org/drawingml/2006/picture">
+                <pic:pic xmlns:pic="http://schemas.openxmlformats.org/drawingml/2006/picture">
+                  <pic:nvPicPr>
+                    <pic:cNvPr id="0" name="Picture 9"/>
+                    <pic:cNvPicPr>
+                      <a:picLocks noChangeAspect="1" noChangeArrowheads="1"/>
+                    </pic:cNvPicPr>
+                  </pic:nvPicPr>
+                  <pic:blipFill>
+                    <a:blip r:embed="rId8" cstate="print">
+                      <a:extLst>
+                        <a:ext uri="{28A0092B-C50C-407E-A947-70E740481C1C}">
+                          <a14:useLocalDpi xmlns:a14="http://schemas.microsoft.com/office/drawing/2010/main" val="0"/>
+                        </a:ext>
+                      </a:extLst>
+                    </a:blip>
+                    <a:srcRect/>
+                    <a:stretch>
+                      <a:fillRect/>
+                    </a:stretch>
+                  </pic:blipFill>
+                  <pic:spPr bwMode="auto">
+                    <a:xfrm>
+                      <a:off x="0" y="0"/>
+                      <a:ext cx="5943600" cy="4552545"/>
+                    </a:xfrm>
+                    <a:prstGeom prst="rect">
+                      <a:avLst/>
+                    </a:prstGeom>
+                    <a:noFill/>
+                    <a:ln>
+                      <a:noFill/>
+                    </a:ln>
+                  </pic:spPr>
+                </pic:pic>
+              </a:graphicData>
+            </a:graphic>
+          </wp:inline>
+        </w:drawing>
+      </w:r>
+    </w:p>
+    <w:p/>
+    <w:p>
+      <w:pPr>
+        <w:pStyle w:val="Heading2"/>
+        <w:rPr>
+          <w:rFonts w:eastAsia="Times New Roman"/>
+        </w:rPr>
+      </w:pPr>
+      <w:r>
+        <w:rPr>
+          <w:rFonts w:eastAsia="Times New Roman"/>
+        </w:rPr>
+        <w:lastRenderedPageBreak/>
+        <w:t>Update Product Price (At Shop)</w:t>
+      </w:r>
+    </w:p>
+    <w:p>
+      <w:r>
+        <w:rPr>
+          <w:noProof/>
+        </w:rPr>
+        <w:drawing>
+          <wp:inline distT="0" distB="0" distL="0" distR="0" wp14:anchorId="62C9523F" wp14:editId="7F993A7B">
+            <wp:extent cx="5943600" cy="6577231"/>
+            <wp:effectExtent l="0" t="0" r="0" b="0"/>
+            <wp:docPr id="7" name="Picture 7"/>
+            <wp:cNvGraphicFramePr>
+              <a:graphicFrameLocks xmlns:a="http://schemas.openxmlformats.org/drawingml/2006/main" noChangeAspect="1"/>
+            </wp:cNvGraphicFramePr>
+            <a:graphic xmlns:a="http://schemas.openxmlformats.org/drawingml/2006/main">
+              <a:graphicData uri="http://schemas.openxmlformats.org/drawingml/2006/picture">
+                <pic:pic xmlns:pic="http://schemas.openxmlformats.org/drawingml/2006/picture">
+                  <pic:nvPicPr>
+                    <pic:cNvPr id="0" name="Picture 11"/>
+                    <pic:cNvPicPr>
+                      <a:picLocks noChangeAspect="1" noChangeArrowheads="1"/>
+                    </pic:cNvPicPr>
+                  </pic:nvPicPr>
+                  <pic:blipFill>
+                    <a:blip r:embed="rId9" cstate="print">
+                      <a:extLst>
+                        <a:ext uri="{28A0092B-C50C-407E-A947-70E740481C1C}">
+                          <a14:useLocalDpi xmlns:a14="http://schemas.microsoft.com/office/drawing/2010/main" val="0"/>
+                        </a:ext>
+                      </a:extLst>
+                    </a:blip>
+                    <a:srcRect/>
+                    <a:stretch>
+                      <a:fillRect/>
+                    </a:stretch>
+                  </pic:blipFill>
+                  <pic:spPr bwMode="auto">
+                    <a:xfrm>
+                      <a:off x="0" y="0"/>
+                      <a:ext cx="5943600" cy="6577231"/>
+                    </a:xfrm>
+                    <a:prstGeom prst="rect">
+                      <a:avLst/>
+                    </a:prstGeom>
+                    <a:noFill/>
+                    <a:ln>
+                      <a:noFill/>
+                    </a:ln>
+                  </pic:spPr>
+                </pic:pic>
+              </a:graphicData>
+            </a:graphic>
+          </wp:inline>
+        </w:drawing>
+      </w:r>
+    </w:p>
+    <w:p>
+      <w:pPr>
+        <w:pStyle w:val="Heading2"/>
+      </w:pPr>
+      <w:r>
+        <w:lastRenderedPageBreak/>
+        <w:t>Mark Order Processed / Delivered (UC-15)</w:t>
+      </w:r>
+    </w:p>
+    <w:p>
+      <w:r>
+        <w:rPr>
+          <w:noProof/>
+        </w:rPr>
+        <w:drawing>
+          <wp:inline distT="0" distB="0" distL="0" distR="0" wp14:anchorId="2FBFEDE1" wp14:editId="298A1321">
+            <wp:extent cx="5943600" cy="5359954"/>
+            <wp:effectExtent l="0" t="0" r="0" b="0"/>
+            <wp:docPr id="8" name="Picture 8"/>
+            <wp:cNvGraphicFramePr>
+              <a:graphicFrameLocks xmlns:a="http://schemas.openxmlformats.org/drawingml/2006/main" noChangeAspect="1"/>
+            </wp:cNvGraphicFramePr>
+            <a:graphic xmlns:a="http://schemas.openxmlformats.org/drawingml/2006/main">
+              <a:graphicData uri="http://schemas.openxmlformats.org/drawingml/2006/picture">
+                <pic:pic xmlns:pic="http://schemas.openxmlformats.org/drawingml/2006/picture">
+                  <pic:nvPicPr>
+                    <pic:cNvPr id="0" name="Picture 13"/>
+                    <pic:cNvPicPr>
+                      <a:picLocks noChangeAspect="1" noChangeArrowheads="1"/>
+                    </pic:cNvPicPr>
+                  </pic:nvPicPr>
+                  <pic:blipFill>
+                    <a:blip r:embed="rId10" cstate="print">
+                      <a:extLst>
+                        <a:ext uri="{28A0092B-C50C-407E-A947-70E740481C1C}">
+                          <a14:useLocalDpi xmlns:a14="http://schemas.microsoft.com/office/drawing/2010/main" val="0"/>
+                        </a:ext>
+                      </a:extLst>
+                    </a:blip>
+                    <a:srcRect/>
+                    <a:stretch>
+                      <a:fillRect/>
+                    </a:stretch>
+                  </pic:blipFill>
+                  <pic:spPr bwMode="auto">
+                    <a:xfrm>
+                      <a:off x="0" y="0"/>
+                      <a:ext cx="5943600" cy="5359954"/>
+                    </a:xfrm>
+                    <a:prstGeom prst="rect">
+                      <a:avLst/>
+                    </a:prstGeom>
+                    <a:noFill/>
+                    <a:ln>
+                      <a:noFill/>
+                    </a:ln>
+                  </pic:spPr>
+                </pic:pic>
+              </a:graphicData>
+            </a:graphic>
+          </wp:inline>
+        </w:drawing>
+      </w:r>
+    </w:p>
+    <w:p>
+      <w:pPr>
+        <w:pStyle w:val="Heading2"/>
+      </w:pPr>
+      <w:r>
+        <w:lastRenderedPageBreak/>
+        <w:t xml:space="preserve">Handle Undelivered / Return </w:t>
+      </w:r>
+    </w:p>
+    <w:p>
+      <w:r>
+        <w:rPr>
+          <w:noProof/>
+        </w:rPr>
+        <w:drawing>
+          <wp:inline distT="0" distB="0" distL="0" distR="0" wp14:anchorId="6D51C4AB" wp14:editId="31D55E2D">
+            <wp:extent cx="5943600" cy="6953942"/>
+            <wp:effectExtent l="0" t="0" r="0" b="0"/>
+            <wp:docPr id="9" name="Picture 9"/>
+            <wp:cNvGraphicFramePr>
+              <a:graphicFrameLocks xmlns:a="http://schemas.openxmlformats.org/drawingml/2006/main" noChangeAspect="1"/>
+            </wp:cNvGraphicFramePr>
+            <a:graphic xmlns:a="http://schemas.openxmlformats.org/drawingml/2006/main">
+              <a:graphicData uri="http://schemas.openxmlformats.org/drawingml/2006/picture">
+                <pic:pic xmlns:pic="http://schemas.openxmlformats.org/drawingml/2006/picture">
+                  <pic:nvPicPr>
+                    <pic:cNvPr id="0" name="Picture 15"/>
+                    <pic:cNvPicPr>
+                      <a:picLocks noChangeAspect="1" noChangeArrowheads="1"/>
+                    </pic:cNvPicPr>
+                  </pic:nvPicPr>
+                  <pic:blipFill>
+                    <a:blip r:embed="rId11" cstate="print">
+                      <a:extLst>
+                        <a:ext uri="{28A0092B-C50C-407E-A947-70E740481C1C}">
+                          <a14:useLocalDpi xmlns:a14="http://schemas.microsoft.com/office/drawing/2010/main" val="0"/>
+                        </a:ext>
+                      </a:extLst>
+                    </a:blip>
+                    <a:srcRect/>
+                    <a:stretch>
+                      <a:fillRect/>
+                    </a:stretch>
+                  </pic:blipFill>
+                  <pic:spPr bwMode="auto">
+                    <a:xfrm>
+                      <a:off x="0" y="0"/>
+                      <a:ext cx="5943600" cy="6953942"/>
+                    </a:xfrm>
+                    <a:prstGeom prst="rect">
+                      <a:avLst/>
+                    </a:prstGeom>
+                    <a:noFill/>
+                    <a:ln>
+                      <a:noFill/>
+                    </a:ln>
+                  </pic:spPr>
+                </pic:pic>
+              </a:graphicData>
+            </a:graphic>
+          </wp:inline>
+        </w:drawing>
+      </w:r>
+    </w:p>
+    <w:p>
+      <w:pPr>
+        <w:pStyle w:val="Heading2"/>
+        <w:rPr>
+          <w:rStyle w:val="Strong"/>
+          <w:rFonts w:ascii="Segoe UI" w:hAnsi="Segoe UI" w:cs="Segoe UI"/>
+          <w:color w:val="0F1115"/>
+          <w:shd w:val="clear" w:color="auto" w:fill="FFFFFF"/>
+        </w:rPr>
+      </w:pPr>
+      <w:r>
+        <w:rPr>
+          <w:rStyle w:val="Strong"/>
+          <w:rFonts w:ascii="Segoe UI" w:hAnsi="Segoe UI" w:cs="Segoe UI"/>
+          <w:color w:val="0F1115"/>
+          <w:shd w:val="clear" w:color="auto" w:fill="FFFFFF"/>
+        </w:rPr>
+        <w:lastRenderedPageBreak/>
+        <w:t>Report Incident (Deviation, Vehicle, Health)</w:t>
+      </w:r>
+    </w:p>
+    <w:p>
+      <w:r>
+        <w:rPr>
+          <w:noProof/>
+        </w:rPr>
+        <w:lastRenderedPageBreak/>
+        <w:drawing>
+          <wp:inline distT="0" distB="0" distL="0" distR="0" wp14:anchorId="7478F195" wp14:editId="5750EE45">
+            <wp:extent cx="5943600" cy="8524155"/>
+            <wp:effectExtent l="0" t="0" r="0" b="0"/>
+            <wp:docPr id="10" name="Picture 10"/>
+            <wp:cNvGraphicFramePr>
+              <a:graphicFrameLocks xmlns:a="http://schemas.openxmlformats.org/drawingml/2006/main" noChangeAspect="1"/>
+            </wp:cNvGraphicFramePr>
+            <a:graphic xmlns:a="http://schemas.openxmlformats.org/drawingml/2006/main">
+              <a:graphicData uri="http://schemas.openxmlformats.org/drawingml/2006/picture">
+                <pic:pic xmlns:pic="http://schemas.openxmlformats.org/drawingml/2006/picture">
+                  <pic:nvPicPr>
+                    <pic:cNvPr id="0" name="Picture 17"/>
+                    <pic:cNvPicPr>
+                      <a:picLocks noChangeAspect="1" noChangeArrowheads="1"/>
+                    </pic:cNvPicPr>
+                  </pic:nvPicPr>
+                  <pic:blipFill>
+                    <a:blip r:embed="rId12" cstate="print">
+                      <a:extLst>
+                        <a:ext uri="{28A0092B-C50C-407E-A947-70E740481C1C}">
+                          <a14:useLocalDpi xmlns:a14="http://schemas.microsoft.com/office/drawing/2010/main" val="0"/>
+                        </a:ext>
+                      </a:extLst>
+                    </a:blip>
+                    <a:srcRect/>
+                    <a:stretch>
+                      <a:fillRect/>
+                    </a:stretch>
+                  </pic:blipFill>
+                  <pic:spPr bwMode="auto">
+                    <a:xfrm>
+                      <a:off x="0" y="0"/>
+                      <a:ext cx="5943600" cy="8524155"/>
+                    </a:xfrm>
+                    <a:prstGeom prst="rect">
+                      <a:avLst/>
+                    </a:prstGeom>
+                    <a:noFill/>
+                    <a:ln>
+                      <a:noFill/>
+                    </a:ln>
+                  </pic:spPr>
+                </pic:pic>
+              </a:graphicData>
+            </a:graphic>
+          </wp:inline>
+        </w:drawing>
+      </w:r>
+    </w:p>
+    <w:p>
+      <w:pPr>
+        <w:pStyle w:val="Heading2"/>
+      </w:pPr>
+      <w:r>
+        <w:lastRenderedPageBreak/>
+        <w:t xml:space="preserve">Close Rider Account </w:t>
+      </w:r>
+    </w:p>
+    <w:p>
+      <w:r>
+        <w:rPr>
+          <w:noProof/>
+        </w:rPr>
+        <w:drawing>
+          <wp:inline distT="0" distB="0" distL="0" distR="0" wp14:anchorId="0EA9DE8D" wp14:editId="41DFF76B">
+            <wp:extent cx="5943600" cy="6481237"/>
+            <wp:effectExtent l="0" t="0" r="0" b="0"/>
+            <wp:docPr id="11" name="Picture 11"/>
+            <wp:cNvGraphicFramePr>
+              <a:graphicFrameLocks xmlns:a="http://schemas.openxmlformats.org/drawingml/2006/main" noChangeAspect="1"/>
+            </wp:cNvGraphicFramePr>
+            <a:graphic xmlns:a="http://schemas.openxmlformats.org/drawingml/2006/main">
+              <a:graphicData uri="http://schemas.openxmlformats.org/drawingml/2006/picture">
+                <pic:pic xmlns:pic="http://schemas.openxmlformats.org/drawingml/2006/picture">
+                  <pic:nvPicPr>
+                    <pic:cNvPr id="0" name="Picture 19"/>
+                    <pic:cNvPicPr>
+                      <a:picLocks noChangeAspect="1" noChangeArrowheads="1"/>
+                    </pic:cNvPicPr>
+                  </pic:nvPicPr>
+                  <pic:blipFill>
+                    <a:blip r:embed="rId13" cstate="print">
+                      <a:extLst>
+                        <a:ext uri="{28A0092B-C50C-407E-A947-70E740481C1C}">
+                          <a14:useLocalDpi xmlns:a14="http://schemas.microsoft.com/office/drawing/2010/main" val="0"/>
+                        </a:ext>
+                      </a:extLst>
+                    </a:blip>
+                    <a:srcRect/>
+                    <a:stretch>
+                      <a:fillRect/>
+                    </a:stretch>
+                  </pic:blipFill>
+                  <pic:spPr bwMode="auto">
+                    <a:xfrm>
+                      <a:off x="0" y="0"/>
+                      <a:ext cx="5943600" cy="6481237"/>
+                    </a:xfrm>
+                    <a:prstGeom prst="rect">
+                      <a:avLst/>
+                    </a:prstGeom>
+                    <a:noFill/>
+                    <a:ln>
+                      <a:noFill/>
+                    </a:ln>
+                  </pic:spPr>
+                </pic:pic>
+              </a:graphicData>
+            </a:graphic>
+          </wp:inline>
+        </w:drawing>
+      </w:r>
+    </w:p>
+    <w:p>
+      <w:pPr>
+        <w:pStyle w:val="Heading2"/>
+      </w:pPr>
+      <w:r>
+        <w:t>View Financial Reports</w:t>
+      </w:r>
+      <w:bookmarkStart w:id="0" w:name="_GoBack"/>
       <w:bookmarkEnd w:id="0"/>
     </w:p>
+    <w:p/>
     <w:sectPr>
       <w:pgSz w:w="12240" w:h="15840"/>
       <w:pgMar w:top="1440" w:right="1440" w:bottom="1440" w:left="1440" w:header="720" w:footer="720" w:gutter="0"/>
@@ -496,6 +1118,28 @@
       <w:szCs w:val="32"/>
     </w:rPr>
   </w:style>
+  <w:style w:type="paragraph" w:styleId="Heading2">
+    <w:name w:val="heading 2"/>
+    <w:basedOn w:val="Normal"/>
+    <w:next w:val="Normal"/>
+    <w:link w:val="Heading2Char"/>
+    <w:uiPriority w:val="9"/>
+    <w:unhideWhenUsed/>
+    <w:qFormat/>
+    <w:rsid w:val="00E06D27"/>
+    <w:pPr>
+      <w:keepNext/>
+      <w:keepLines/>
+      <w:spacing w:before="40" w:after="0"/>
+      <w:outlineLvl w:val="1"/>
+    </w:pPr>
+    <w:rPr>
+      <w:rFonts w:asciiTheme="majorHAnsi" w:eastAsiaTheme="majorEastAsia" w:hAnsiTheme="majorHAnsi" w:cstheme="majorBidi"/>
+      <w:color w:val="2F5496" w:themeColor="accent1" w:themeShade="BF"/>
+      <w:sz w:val="26"/>
+      <w:szCs w:val="26"/>
+    </w:rPr>
+  </w:style>
   <w:style w:type="character" w:default="1" w:styleId="DefaultParagraphFont">
     <w:name w:val="Default Paragraph Font"/>
     <w:uiPriority w:val="1"/>
@@ -534,6 +1178,91 @@
       <w:color w:val="2F5496" w:themeColor="accent1" w:themeShade="BF"/>
       <w:sz w:val="32"/>
       <w:szCs w:val="32"/>
+    </w:rPr>
+  </w:style>
+  <w:style w:type="character" w:customStyle="1" w:styleId="Heading2Char">
+    <w:name w:val="Heading 2 Char"/>
+    <w:basedOn w:val="DefaultParagraphFont"/>
+    <w:link w:val="Heading2"/>
+    <w:uiPriority w:val="9"/>
+    <w:rsid w:val="00E06D27"/>
+    <w:rPr>
+      <w:rFonts w:asciiTheme="majorHAnsi" w:eastAsiaTheme="majorEastAsia" w:hAnsiTheme="majorHAnsi" w:cstheme="majorBidi"/>
+      <w:color w:val="2F5496" w:themeColor="accent1" w:themeShade="BF"/>
+      <w:sz w:val="26"/>
+      <w:szCs w:val="26"/>
+    </w:rPr>
+  </w:style>
+  <w:style w:type="paragraph" w:styleId="HTMLPreformatted">
+    <w:name w:val="HTML Preformatted"/>
+    <w:basedOn w:val="Normal"/>
+    <w:link w:val="HTMLPreformattedChar"/>
+    <w:uiPriority w:val="99"/>
+    <w:unhideWhenUsed/>
+    <w:rsid w:val="00343680"/>
+    <w:pPr>
+      <w:tabs>
+        <w:tab w:val="left" w:pos="916"/>
+        <w:tab w:val="left" w:pos="1832"/>
+        <w:tab w:val="left" w:pos="2748"/>
+        <w:tab w:val="left" w:pos="3664"/>
+        <w:tab w:val="left" w:pos="4580"/>
+        <w:tab w:val="left" w:pos="5496"/>
+        <w:tab w:val="left" w:pos="6412"/>
+        <w:tab w:val="left" w:pos="7328"/>
+        <w:tab w:val="left" w:pos="8244"/>
+        <w:tab w:val="left" w:pos="9160"/>
+        <w:tab w:val="left" w:pos="10076"/>
+        <w:tab w:val="left" w:pos="10992"/>
+        <w:tab w:val="left" w:pos="11908"/>
+        <w:tab w:val="left" w:pos="12824"/>
+        <w:tab w:val="left" w:pos="13740"/>
+        <w:tab w:val="left" w:pos="14656"/>
+      </w:tabs>
+      <w:spacing w:after="0" w:line="240" w:lineRule="auto"/>
+    </w:pPr>
+    <w:rPr>
+      <w:rFonts w:ascii="Courier New" w:eastAsia="Times New Roman" w:hAnsi="Courier New" w:cs="Courier New"/>
+      <w:sz w:val="20"/>
+      <w:szCs w:val="20"/>
+    </w:rPr>
+  </w:style>
+  <w:style w:type="character" w:customStyle="1" w:styleId="HTMLPreformattedChar">
+    <w:name w:val="HTML Preformatted Char"/>
+    <w:basedOn w:val="DefaultParagraphFont"/>
+    <w:link w:val="HTMLPreformatted"/>
+    <w:uiPriority w:val="99"/>
+    <w:rsid w:val="00343680"/>
+    <w:rPr>
+      <w:rFonts w:ascii="Courier New" w:eastAsia="Times New Roman" w:hAnsi="Courier New" w:cs="Courier New"/>
+      <w:sz w:val="20"/>
+      <w:szCs w:val="20"/>
+    </w:rPr>
+  </w:style>
+  <w:style w:type="character" w:styleId="Strong">
+    <w:name w:val="Strong"/>
+    <w:basedOn w:val="DefaultParagraphFont"/>
+    <w:uiPriority w:val="22"/>
+    <w:qFormat/>
+    <w:rsid w:val="00820659"/>
+    <w:rPr>
+      <w:b/>
+      <w:bCs/>
+    </w:rPr>
+  </w:style>
+  <w:style w:type="paragraph" w:styleId="NormalWeb">
+    <w:name w:val="Normal (Web)"/>
+    <w:basedOn w:val="Normal"/>
+    <w:uiPriority w:val="99"/>
+    <w:unhideWhenUsed/>
+    <w:rsid w:val="00D074DB"/>
+    <w:pPr>
+      <w:spacing w:before="100" w:beforeAutospacing="1" w:after="100" w:afterAutospacing="1" w:line="240" w:lineRule="auto"/>
+    </w:pPr>
+    <w:rPr>
+      <w:rFonts w:ascii="Times New Roman" w:eastAsia="Times New Roman" w:hAnsi="Times New Roman" w:cs="Times New Roman"/>
+      <w:sz w:val="24"/>
+      <w:szCs w:val="24"/>
     </w:rPr>
   </w:style>
 </w:styles>

</xml_diff>

<commit_message>
completed all sequence diagram
</commit_message>
<xml_diff>
--- a/SDS Document Diagram.docx
+++ b/SDS Document Diagram.docx
@@ -683,12 +683,649 @@
         <w:pStyle w:val="Heading2"/>
       </w:pPr>
       <w:r>
+        <w:lastRenderedPageBreak/>
         <w:t>View Financial Reports</w:t>
+      </w:r>
+    </w:p>
+    <w:p>
+      <w:r>
+        <w:rPr>
+          <w:noProof/>
+        </w:rPr>
+        <w:drawing>
+          <wp:inline distT="0" distB="0" distL="0" distR="0" wp14:anchorId="51A319C4" wp14:editId="0E3F692D">
+            <wp:extent cx="5943600" cy="6334774"/>
+            <wp:effectExtent l="0" t="0" r="0" b="8890"/>
+            <wp:docPr id="12" name="Picture 12"/>
+            <wp:cNvGraphicFramePr>
+              <a:graphicFrameLocks xmlns:a="http://schemas.openxmlformats.org/drawingml/2006/main" noChangeAspect="1"/>
+            </wp:cNvGraphicFramePr>
+            <a:graphic xmlns:a="http://schemas.openxmlformats.org/drawingml/2006/main">
+              <a:graphicData uri="http://schemas.openxmlformats.org/drawingml/2006/picture">
+                <pic:pic xmlns:pic="http://schemas.openxmlformats.org/drawingml/2006/picture">
+                  <pic:nvPicPr>
+                    <pic:cNvPr id="0" name="Picture 21"/>
+                    <pic:cNvPicPr>
+                      <a:picLocks noChangeAspect="1" noChangeArrowheads="1"/>
+                    </pic:cNvPicPr>
+                  </pic:nvPicPr>
+                  <pic:blipFill>
+                    <a:blip r:embed="rId14" cstate="print">
+                      <a:extLst>
+                        <a:ext uri="{28A0092B-C50C-407E-A947-70E740481C1C}">
+                          <a14:useLocalDpi xmlns:a14="http://schemas.microsoft.com/office/drawing/2010/main" val="0"/>
+                        </a:ext>
+                      </a:extLst>
+                    </a:blip>
+                    <a:srcRect/>
+                    <a:stretch>
+                      <a:fillRect/>
+                    </a:stretch>
+                  </pic:blipFill>
+                  <pic:spPr bwMode="auto">
+                    <a:xfrm>
+                      <a:off x="0" y="0"/>
+                      <a:ext cx="5943600" cy="6334774"/>
+                    </a:xfrm>
+                    <a:prstGeom prst="rect">
+                      <a:avLst/>
+                    </a:prstGeom>
+                    <a:noFill/>
+                    <a:ln>
+                      <a:noFill/>
+                    </a:ln>
+                  </pic:spPr>
+                </pic:pic>
+              </a:graphicData>
+            </a:graphic>
+          </wp:inline>
+        </w:drawing>
+      </w:r>
+    </w:p>
+    <w:p>
+      <w:pPr>
+        <w:pStyle w:val="Heading2"/>
+      </w:pPr>
+      <w:r>
+        <w:lastRenderedPageBreak/>
+        <w:t>Monitor Live Map &amp; Routes (Animate Order, Intervene)</w:t>
+      </w:r>
+    </w:p>
+    <w:p>
+      <w:r>
+        <w:rPr>
+          <w:noProof/>
+        </w:rPr>
+        <w:drawing>
+          <wp:inline distT="0" distB="0" distL="0" distR="0" wp14:anchorId="397A7865" wp14:editId="58DB7900">
+            <wp:extent cx="5943600" cy="7240134"/>
+            <wp:effectExtent l="0" t="0" r="0" b="0"/>
+            <wp:docPr id="13" name="Picture 13"/>
+            <wp:cNvGraphicFramePr>
+              <a:graphicFrameLocks xmlns:a="http://schemas.openxmlformats.org/drawingml/2006/main" noChangeAspect="1"/>
+            </wp:cNvGraphicFramePr>
+            <a:graphic xmlns:a="http://schemas.openxmlformats.org/drawingml/2006/main">
+              <a:graphicData uri="http://schemas.openxmlformats.org/drawingml/2006/picture">
+                <pic:pic xmlns:pic="http://schemas.openxmlformats.org/drawingml/2006/picture">
+                  <pic:nvPicPr>
+                    <pic:cNvPr id="0" name="Picture 23"/>
+                    <pic:cNvPicPr>
+                      <a:picLocks noChangeAspect="1" noChangeArrowheads="1"/>
+                    </pic:cNvPicPr>
+                  </pic:nvPicPr>
+                  <pic:blipFill>
+                    <a:blip r:embed="rId15" cstate="print">
+                      <a:extLst>
+                        <a:ext uri="{28A0092B-C50C-407E-A947-70E740481C1C}">
+                          <a14:useLocalDpi xmlns:a14="http://schemas.microsoft.com/office/drawing/2010/main" val="0"/>
+                        </a:ext>
+                      </a:extLst>
+                    </a:blip>
+                    <a:srcRect/>
+                    <a:stretch>
+                      <a:fillRect/>
+                    </a:stretch>
+                  </pic:blipFill>
+                  <pic:spPr bwMode="auto">
+                    <a:xfrm>
+                      <a:off x="0" y="0"/>
+                      <a:ext cx="5943600" cy="7240134"/>
+                    </a:xfrm>
+                    <a:prstGeom prst="rect">
+                      <a:avLst/>
+                    </a:prstGeom>
+                    <a:noFill/>
+                    <a:ln>
+                      <a:noFill/>
+                    </a:ln>
+                  </pic:spPr>
+                </pic:pic>
+              </a:graphicData>
+            </a:graphic>
+          </wp:inline>
+        </w:drawing>
+      </w:r>
+    </w:p>
+    <w:p>
+      <w:pPr>
+        <w:pStyle w:val="Heading2"/>
+      </w:pPr>
+      <w:r>
+        <w:lastRenderedPageBreak/>
+        <w:t>View Orders &amp; Customer Messages</w:t>
+      </w:r>
+    </w:p>
+    <w:p>
+      <w:r>
+        <w:rPr>
+          <w:noProof/>
+        </w:rPr>
+        <w:drawing>
+          <wp:inline distT="0" distB="0" distL="0" distR="0" wp14:anchorId="17D1F52B" wp14:editId="082D856F">
+            <wp:extent cx="5943600" cy="6685211"/>
+            <wp:effectExtent l="0" t="0" r="0" b="1905"/>
+            <wp:docPr id="14" name="Picture 14"/>
+            <wp:cNvGraphicFramePr>
+              <a:graphicFrameLocks xmlns:a="http://schemas.openxmlformats.org/drawingml/2006/main" noChangeAspect="1"/>
+            </wp:cNvGraphicFramePr>
+            <a:graphic xmlns:a="http://schemas.openxmlformats.org/drawingml/2006/main">
+              <a:graphicData uri="http://schemas.openxmlformats.org/drawingml/2006/picture">
+                <pic:pic xmlns:pic="http://schemas.openxmlformats.org/drawingml/2006/picture">
+                  <pic:nvPicPr>
+                    <pic:cNvPr id="0" name="Picture 25"/>
+                    <pic:cNvPicPr>
+                      <a:picLocks noChangeAspect="1" noChangeArrowheads="1"/>
+                    </pic:cNvPicPr>
+                  </pic:nvPicPr>
+                  <pic:blipFill>
+                    <a:blip r:embed="rId16" cstate="print">
+                      <a:extLst>
+                        <a:ext uri="{28A0092B-C50C-407E-A947-70E740481C1C}">
+                          <a14:useLocalDpi xmlns:a14="http://schemas.microsoft.com/office/drawing/2010/main" val="0"/>
+                        </a:ext>
+                      </a:extLst>
+                    </a:blip>
+                    <a:srcRect/>
+                    <a:stretch>
+                      <a:fillRect/>
+                    </a:stretch>
+                  </pic:blipFill>
+                  <pic:spPr bwMode="auto">
+                    <a:xfrm>
+                      <a:off x="0" y="0"/>
+                      <a:ext cx="5943600" cy="6685211"/>
+                    </a:xfrm>
+                    <a:prstGeom prst="rect">
+                      <a:avLst/>
+                    </a:prstGeom>
+                    <a:noFill/>
+                    <a:ln>
+                      <a:noFill/>
+                    </a:ln>
+                  </pic:spPr>
+                </pic:pic>
+              </a:graphicData>
+            </a:graphic>
+          </wp:inline>
+        </w:drawing>
+      </w:r>
+    </w:p>
+    <w:p>
+      <w:pPr>
+        <w:pStyle w:val="Heading2"/>
+      </w:pPr>
+      <w:r>
+        <w:lastRenderedPageBreak/>
+        <w:t>Handle Complaints &amp; Returns</w:t>
+      </w:r>
+    </w:p>
+    <w:p>
+      <w:r>
+        <w:rPr>
+          <w:noProof/>
+        </w:rPr>
+        <w:drawing>
+          <wp:inline distT="0" distB="0" distL="0" distR="0" wp14:anchorId="2A5D395F" wp14:editId="5598AB3C">
+            <wp:extent cx="5943600" cy="5943600"/>
+            <wp:effectExtent l="0" t="0" r="0" b="0"/>
+            <wp:docPr id="15" name="Picture 15"/>
+            <wp:cNvGraphicFramePr>
+              <a:graphicFrameLocks xmlns:a="http://schemas.openxmlformats.org/drawingml/2006/main" noChangeAspect="1"/>
+            </wp:cNvGraphicFramePr>
+            <a:graphic xmlns:a="http://schemas.openxmlformats.org/drawingml/2006/main">
+              <a:graphicData uri="http://schemas.openxmlformats.org/drawingml/2006/picture">
+                <pic:pic xmlns:pic="http://schemas.openxmlformats.org/drawingml/2006/picture">
+                  <pic:nvPicPr>
+                    <pic:cNvPr id="0" name="Picture 27"/>
+                    <pic:cNvPicPr>
+                      <a:picLocks noChangeAspect="1" noChangeArrowheads="1"/>
+                    </pic:cNvPicPr>
+                  </pic:nvPicPr>
+                  <pic:blipFill>
+                    <a:blip r:embed="rId17" cstate="print">
+                      <a:extLst>
+                        <a:ext uri="{28A0092B-C50C-407E-A947-70E740481C1C}">
+                          <a14:useLocalDpi xmlns:a14="http://schemas.microsoft.com/office/drawing/2010/main" val="0"/>
+                        </a:ext>
+                      </a:extLst>
+                    </a:blip>
+                    <a:srcRect/>
+                    <a:stretch>
+                      <a:fillRect/>
+                    </a:stretch>
+                  </pic:blipFill>
+                  <pic:spPr bwMode="auto">
+                    <a:xfrm>
+                      <a:off x="0" y="0"/>
+                      <a:ext cx="5943600" cy="5943600"/>
+                    </a:xfrm>
+                    <a:prstGeom prst="rect">
+                      <a:avLst/>
+                    </a:prstGeom>
+                    <a:noFill/>
+                    <a:ln>
+                      <a:noFill/>
+                    </a:ln>
+                  </pic:spPr>
+                </pic:pic>
+              </a:graphicData>
+            </a:graphic>
+          </wp:inline>
+        </w:drawing>
+      </w:r>
+    </w:p>
+    <w:p>
+      <w:pPr>
+        <w:pStyle w:val="Heading2"/>
+      </w:pPr>
+      <w:r>
+        <w:lastRenderedPageBreak/>
+        <w:t>Manage Budgets &amp; Profit Sharing</w:t>
+      </w:r>
+    </w:p>
+    <w:p>
+      <w:r>
+        <w:rPr>
+          <w:noProof/>
+        </w:rPr>
+        <w:drawing>
+          <wp:inline distT="0" distB="0" distL="0" distR="0" wp14:anchorId="2022652F" wp14:editId="0A374E18">
+            <wp:extent cx="5943600" cy="7126752"/>
+            <wp:effectExtent l="0" t="0" r="0" b="0"/>
+            <wp:docPr id="16" name="Picture 16"/>
+            <wp:cNvGraphicFramePr>
+              <a:graphicFrameLocks xmlns:a="http://schemas.openxmlformats.org/drawingml/2006/main" noChangeAspect="1"/>
+            </wp:cNvGraphicFramePr>
+            <a:graphic xmlns:a="http://schemas.openxmlformats.org/drawingml/2006/main">
+              <a:graphicData uri="http://schemas.openxmlformats.org/drawingml/2006/picture">
+                <pic:pic xmlns:pic="http://schemas.openxmlformats.org/drawingml/2006/picture">
+                  <pic:nvPicPr>
+                    <pic:cNvPr id="0" name="Picture 29"/>
+                    <pic:cNvPicPr>
+                      <a:picLocks noChangeAspect="1" noChangeArrowheads="1"/>
+                    </pic:cNvPicPr>
+                  </pic:nvPicPr>
+                  <pic:blipFill>
+                    <a:blip r:embed="rId18" cstate="print">
+                      <a:extLst>
+                        <a:ext uri="{28A0092B-C50C-407E-A947-70E740481C1C}">
+                          <a14:useLocalDpi xmlns:a14="http://schemas.microsoft.com/office/drawing/2010/main" val="0"/>
+                        </a:ext>
+                      </a:extLst>
+                    </a:blip>
+                    <a:srcRect/>
+                    <a:stretch>
+                      <a:fillRect/>
+                    </a:stretch>
+                  </pic:blipFill>
+                  <pic:spPr bwMode="auto">
+                    <a:xfrm>
+                      <a:off x="0" y="0"/>
+                      <a:ext cx="5943600" cy="7126752"/>
+                    </a:xfrm>
+                    <a:prstGeom prst="rect">
+                      <a:avLst/>
+                    </a:prstGeom>
+                    <a:noFill/>
+                    <a:ln>
+                      <a:noFill/>
+                    </a:ln>
+                  </pic:spPr>
+                </pic:pic>
+              </a:graphicData>
+            </a:graphic>
+          </wp:inline>
+        </w:drawing>
+      </w:r>
+    </w:p>
+    <w:p>
+      <w:pPr>
+        <w:pStyle w:val="Heading2"/>
+      </w:pPr>
+      <w:r>
+        <w:lastRenderedPageBreak/>
+        <w:t>Configure Discount Events</w:t>
+      </w:r>
+    </w:p>
+    <w:p>
+      <w:r>
+        <w:rPr>
+          <w:noProof/>
+        </w:rPr>
+        <w:drawing>
+          <wp:inline distT="0" distB="0" distL="0" distR="0" wp14:anchorId="51C82ABC" wp14:editId="31E47A43">
+            <wp:extent cx="5943600" cy="7126752"/>
+            <wp:effectExtent l="0" t="0" r="0" b="0"/>
+            <wp:docPr id="17" name="Picture 17"/>
+            <wp:cNvGraphicFramePr>
+              <a:graphicFrameLocks xmlns:a="http://schemas.openxmlformats.org/drawingml/2006/main" noChangeAspect="1"/>
+            </wp:cNvGraphicFramePr>
+            <a:graphic xmlns:a="http://schemas.openxmlformats.org/drawingml/2006/main">
+              <a:graphicData uri="http://schemas.openxmlformats.org/drawingml/2006/picture">
+                <pic:pic xmlns:pic="http://schemas.openxmlformats.org/drawingml/2006/picture">
+                  <pic:nvPicPr>
+                    <pic:cNvPr id="0" name="Picture 31"/>
+                    <pic:cNvPicPr>
+                      <a:picLocks noChangeAspect="1" noChangeArrowheads="1"/>
+                    </pic:cNvPicPr>
+                  </pic:nvPicPr>
+                  <pic:blipFill>
+                    <a:blip r:embed="rId18" cstate="print">
+                      <a:extLst>
+                        <a:ext uri="{28A0092B-C50C-407E-A947-70E740481C1C}">
+                          <a14:useLocalDpi xmlns:a14="http://schemas.microsoft.com/office/drawing/2010/main" val="0"/>
+                        </a:ext>
+                      </a:extLst>
+                    </a:blip>
+                    <a:srcRect/>
+                    <a:stretch>
+                      <a:fillRect/>
+                    </a:stretch>
+                  </pic:blipFill>
+                  <pic:spPr bwMode="auto">
+                    <a:xfrm>
+                      <a:off x="0" y="0"/>
+                      <a:ext cx="5943600" cy="7126752"/>
+                    </a:xfrm>
+                    <a:prstGeom prst="rect">
+                      <a:avLst/>
+                    </a:prstGeom>
+                    <a:noFill/>
+                    <a:ln>
+                      <a:noFill/>
+                    </a:ln>
+                  </pic:spPr>
+                </pic:pic>
+              </a:graphicData>
+            </a:graphic>
+          </wp:inline>
+        </w:drawing>
+      </w:r>
+    </w:p>
+    <w:p>
+      <w:pPr>
+        <w:pStyle w:val="Heading2"/>
+      </w:pPr>
+      <w:r>
+        <w:lastRenderedPageBreak/>
+        <w:t>Manage Rider Accounts (Close, Fine)</w:t>
+      </w:r>
+    </w:p>
+    <w:p>
+      <w:r>
+        <w:rPr>
+          <w:noProof/>
+        </w:rPr>
+        <w:drawing>
+          <wp:inline distT="0" distB="0" distL="0" distR="0" wp14:anchorId="58FF9EA9" wp14:editId="7D1970DD">
+            <wp:extent cx="5943600" cy="5794623"/>
+            <wp:effectExtent l="0" t="0" r="0" b="0"/>
+            <wp:docPr id="18" name="Picture 18"/>
+            <wp:cNvGraphicFramePr>
+              <a:graphicFrameLocks xmlns:a="http://schemas.openxmlformats.org/drawingml/2006/main" noChangeAspect="1"/>
+            </wp:cNvGraphicFramePr>
+            <a:graphic xmlns:a="http://schemas.openxmlformats.org/drawingml/2006/main">
+              <a:graphicData uri="http://schemas.openxmlformats.org/drawingml/2006/picture">
+                <pic:pic xmlns:pic="http://schemas.openxmlformats.org/drawingml/2006/picture">
+                  <pic:nvPicPr>
+                    <pic:cNvPr id="0" name="Picture 33"/>
+                    <pic:cNvPicPr>
+                      <a:picLocks noChangeAspect="1" noChangeArrowheads="1"/>
+                    </pic:cNvPicPr>
+                  </pic:nvPicPr>
+                  <pic:blipFill>
+                    <a:blip r:embed="rId19" cstate="print">
+                      <a:extLst>
+                        <a:ext uri="{28A0092B-C50C-407E-A947-70E740481C1C}">
+                          <a14:useLocalDpi xmlns:a14="http://schemas.microsoft.com/office/drawing/2010/main" val="0"/>
+                        </a:ext>
+                      </a:extLst>
+                    </a:blip>
+                    <a:srcRect/>
+                    <a:stretch>
+                      <a:fillRect/>
+                    </a:stretch>
+                  </pic:blipFill>
+                  <pic:spPr bwMode="auto">
+                    <a:xfrm>
+                      <a:off x="0" y="0"/>
+                      <a:ext cx="5943600" cy="5794623"/>
+                    </a:xfrm>
+                    <a:prstGeom prst="rect">
+                      <a:avLst/>
+                    </a:prstGeom>
+                    <a:noFill/>
+                    <a:ln>
+                      <a:noFill/>
+                    </a:ln>
+                  </pic:spPr>
+                </pic:pic>
+              </a:graphicData>
+            </a:graphic>
+          </wp:inline>
+        </w:drawing>
+      </w:r>
+    </w:p>
+    <w:p>
+      <w:pPr>
+        <w:pStyle w:val="Heading2"/>
+      </w:pPr>
+      <w:r>
+        <w:lastRenderedPageBreak/>
+        <w:t>Approve Price Update Requests</w:t>
+      </w:r>
+    </w:p>
+    <w:p>
+      <w:r>
+        <w:rPr>
+          <w:noProof/>
+        </w:rPr>
+        <w:drawing>
+          <wp:inline distT="0" distB="0" distL="0" distR="0" wp14:anchorId="231E327A" wp14:editId="1F815615">
+            <wp:extent cx="5943600" cy="6102576"/>
+            <wp:effectExtent l="0" t="0" r="0" b="0"/>
+            <wp:docPr id="19" name="Picture 19"/>
+            <wp:cNvGraphicFramePr>
+              <a:graphicFrameLocks xmlns:a="http://schemas.openxmlformats.org/drawingml/2006/main" noChangeAspect="1"/>
+            </wp:cNvGraphicFramePr>
+            <a:graphic xmlns:a="http://schemas.openxmlformats.org/drawingml/2006/main">
+              <a:graphicData uri="http://schemas.openxmlformats.org/drawingml/2006/picture">
+                <pic:pic xmlns:pic="http://schemas.openxmlformats.org/drawingml/2006/picture">
+                  <pic:nvPicPr>
+                    <pic:cNvPr id="0" name="Picture 35"/>
+                    <pic:cNvPicPr>
+                      <a:picLocks noChangeAspect="1" noChangeArrowheads="1"/>
+                    </pic:cNvPicPr>
+                  </pic:nvPicPr>
+                  <pic:blipFill>
+                    <a:blip r:embed="rId20" cstate="print">
+                      <a:extLst>
+                        <a:ext uri="{28A0092B-C50C-407E-A947-70E740481C1C}">
+                          <a14:useLocalDpi xmlns:a14="http://schemas.microsoft.com/office/drawing/2010/main" val="0"/>
+                        </a:ext>
+                      </a:extLst>
+                    </a:blip>
+                    <a:srcRect/>
+                    <a:stretch>
+                      <a:fillRect/>
+                    </a:stretch>
+                  </pic:blipFill>
+                  <pic:spPr bwMode="auto">
+                    <a:xfrm>
+                      <a:off x="0" y="0"/>
+                      <a:ext cx="5943600" cy="6102576"/>
+                    </a:xfrm>
+                    <a:prstGeom prst="rect">
+                      <a:avLst/>
+                    </a:prstGeom>
+                    <a:noFill/>
+                    <a:ln>
+                      <a:noFill/>
+                    </a:ln>
+                  </pic:spPr>
+                </pic:pic>
+              </a:graphicData>
+            </a:graphic>
+          </wp:inline>
+        </w:drawing>
+      </w:r>
+    </w:p>
+    <w:p>
+      <w:pPr>
+        <w:pStyle w:val="Heading2"/>
+      </w:pPr>
+      <w:r>
+        <w:lastRenderedPageBreak/>
+        <w:t>Deposit / Withdraw App Treasure</w:t>
+      </w:r>
+    </w:p>
+    <w:p>
+      <w:r>
+        <w:rPr>
+          <w:noProof/>
+        </w:rPr>
+        <w:drawing>
+          <wp:inline distT="0" distB="0" distL="0" distR="0" wp14:anchorId="02443BA9" wp14:editId="709DF63B">
+            <wp:extent cx="5943600" cy="5704747"/>
+            <wp:effectExtent l="0" t="0" r="0" b="0"/>
+            <wp:docPr id="20" name="Picture 20"/>
+            <wp:cNvGraphicFramePr>
+              <a:graphicFrameLocks xmlns:a="http://schemas.openxmlformats.org/drawingml/2006/main" noChangeAspect="1"/>
+            </wp:cNvGraphicFramePr>
+            <a:graphic xmlns:a="http://schemas.openxmlformats.org/drawingml/2006/main">
+              <a:graphicData uri="http://schemas.openxmlformats.org/drawingml/2006/picture">
+                <pic:pic xmlns:pic="http://schemas.openxmlformats.org/drawingml/2006/picture">
+                  <pic:nvPicPr>
+                    <pic:cNvPr id="0" name="Picture 37"/>
+                    <pic:cNvPicPr>
+                      <a:picLocks noChangeAspect="1" noChangeArrowheads="1"/>
+                    </pic:cNvPicPr>
+                  </pic:nvPicPr>
+                  <pic:blipFill>
+                    <a:blip r:embed="rId21" cstate="print">
+                      <a:extLst>
+                        <a:ext uri="{28A0092B-C50C-407E-A947-70E740481C1C}">
+                          <a14:useLocalDpi xmlns:a14="http://schemas.microsoft.com/office/drawing/2010/main" val="0"/>
+                        </a:ext>
+                      </a:extLst>
+                    </a:blip>
+                    <a:srcRect/>
+                    <a:stretch>
+                      <a:fillRect/>
+                    </a:stretch>
+                  </pic:blipFill>
+                  <pic:spPr bwMode="auto">
+                    <a:xfrm>
+                      <a:off x="0" y="0"/>
+                      <a:ext cx="5943600" cy="5704747"/>
+                    </a:xfrm>
+                    <a:prstGeom prst="rect">
+                      <a:avLst/>
+                    </a:prstGeom>
+                    <a:noFill/>
+                    <a:ln>
+                      <a:noFill/>
+                    </a:ln>
+                  </pic:spPr>
+                </pic:pic>
+              </a:graphicData>
+            </a:graphic>
+          </wp:inline>
+        </w:drawing>
+      </w:r>
+    </w:p>
+    <w:p>
+      <w:pPr>
+        <w:pStyle w:val="Heading2"/>
+        <w:rPr>
+          <w:rFonts w:eastAsia="Times New Roman"/>
+        </w:rPr>
+      </w:pPr>
+      <w:r>
+        <w:rPr>
+          <w:rFonts w:eastAsia="Times New Roman"/>
+        </w:rPr>
+        <w:lastRenderedPageBreak/>
+        <w:t>Manage Legal Agreements</w:t>
+      </w:r>
+    </w:p>
+    <w:p>
+      <w:r>
+        <w:rPr>
+          <w:noProof/>
+        </w:rPr>
+        <w:drawing>
+          <wp:inline distT="0" distB="0" distL="0" distR="0" wp14:anchorId="4C4419BF" wp14:editId="4CB1239E">
+            <wp:extent cx="5943600" cy="5148411"/>
+            <wp:effectExtent l="0" t="0" r="0" b="0"/>
+            <wp:docPr id="21" name="Picture 21"/>
+            <wp:cNvGraphicFramePr>
+              <a:graphicFrameLocks xmlns:a="http://schemas.openxmlformats.org/drawingml/2006/main" noChangeAspect="1"/>
+            </wp:cNvGraphicFramePr>
+            <a:graphic xmlns:a="http://schemas.openxmlformats.org/drawingml/2006/main">
+              <a:graphicData uri="http://schemas.openxmlformats.org/drawingml/2006/picture">
+                <pic:pic xmlns:pic="http://schemas.openxmlformats.org/drawingml/2006/picture">
+                  <pic:nvPicPr>
+                    <pic:cNvPr id="0" name="Picture 39"/>
+                    <pic:cNvPicPr>
+                      <a:picLocks noChangeAspect="1" noChangeArrowheads="1"/>
+                    </pic:cNvPicPr>
+                  </pic:nvPicPr>
+                  <pic:blipFill>
+                    <a:blip r:embed="rId22" cstate="print">
+                      <a:extLst>
+                        <a:ext uri="{28A0092B-C50C-407E-A947-70E740481C1C}">
+                          <a14:useLocalDpi xmlns:a14="http://schemas.microsoft.com/office/drawing/2010/main" val="0"/>
+                        </a:ext>
+                      </a:extLst>
+                    </a:blip>
+                    <a:srcRect/>
+                    <a:stretch>
+                      <a:fillRect/>
+                    </a:stretch>
+                  </pic:blipFill>
+                  <pic:spPr bwMode="auto">
+                    <a:xfrm>
+                      <a:off x="0" y="0"/>
+                      <a:ext cx="5943600" cy="5148411"/>
+                    </a:xfrm>
+                    <a:prstGeom prst="rect">
+                      <a:avLst/>
+                    </a:prstGeom>
+                    <a:noFill/>
+                    <a:ln>
+                      <a:noFill/>
+                    </a:ln>
+                  </pic:spPr>
+                </pic:pic>
+              </a:graphicData>
+            </a:graphic>
+          </wp:inline>
+        </w:drawing>
       </w:r>
       <w:bookmarkStart w:id="0" w:name="_GoBack"/>
       <w:bookmarkEnd w:id="0"/>
     </w:p>
-    <w:p/>
     <w:sectPr>
       <w:pgSz w:w="12240" w:h="15840"/>
       <w:pgMar w:top="1440" w:right="1440" w:bottom="1440" w:left="1440" w:header="720" w:footer="720" w:gutter="0"/>

</xml_diff>